<commit_message>
feat(se2026): tambahkan klausul tidak perlu mengisi jika sudah didatangi petugas bps
</commit_message>
<xml_diff>
--- a/kegiatan/sensus-ekonomi-2026/2026/outputs/surat-permohonan-pengisian-mandiri-diskominfo.docx
+++ b/kegiatan/sensus-ekonomi-2026/2026/outputs/surat-permohonan-pengisian-mandiri-diskominfo.docx
@@ -326,7 +326,16 @@
     </w:tbl>
     <w:p>
       <w:pPr>
-        <w:spacing w:before="200" w:line="276" w:lineRule="auto"/>
+        <w:spacing w:before="160" w:line="276" w:lineRule="auto"/>
+        <w:jc w:val="both"/>
+      </w:pPr>
+      <w:r>
+        <w:t>Perlu kami sampaikan bahwa apabila pegawai yang bersangkutan telah didatangi dan dilakukan pendataan secara langsung oleh petugas BPS, maka yang bersangkutan tidak perlu melakukan pengisian mandiri kembali.</w:t>
+      </w:r>
+    </w:p>
+    <w:p>
+      <w:pPr>
+        <w:spacing w:before="160" w:line="276" w:lineRule="auto"/>
         <w:jc w:val="both"/>
       </w:pPr>
       <w:r>

</xml_diff>

<commit_message>
feat(se2026): tambahkan tautan tutorial cawi dan rincian tahapan pengisian
</commit_message>
<xml_diff>
--- a/kegiatan/sensus-ekonomi-2026/2026/outputs/surat-permohonan-pengisian-mandiri-diskominfo.docx
+++ b/kegiatan/sensus-ekonomi-2026/2026/outputs/surat-permohonan-pengisian-mandiri-diskominfo.docx
@@ -274,22 +274,24 @@
         <w:br/>
       </w:r>
       <w:r>
-        <w:t>Adapun tautan/link pengisian mandiri tersebut dapat diakses secara daring melalui tautan resmi berikut:</w:t>
+        <w:t>Adapun tautan pengisian mandiri serta tautan panduan/tutorial tahapannya dapat diakses secara daring melalui tautan resmi berikut:</w:t>
       </w:r>
     </w:p>
     <w:tbl>
       <w:tblPr>
         <w:tblW w:type="auto" w:w="0"/>
         <w:jc w:val="center"/>
+        <w:tblLayout w:type="fixed"/>
         <w:tblLook w:firstColumn="1" w:firstRow="1" w:lastColumn="0" w:lastRow="0" w:noHBand="0" w:noVBand="1" w:val="04A0"/>
       </w:tblPr>
       <w:tblGrid>
-        <w:gridCol w:w="9648"/>
+        <w:gridCol w:w="4824"/>
+        <w:gridCol w:w="4824"/>
       </w:tblGrid>
       <w:tr>
         <w:tc>
           <w:tcPr>
-            <w:tcW w:type="dxa" w:w="7920"/>
+            <w:tcW w:type="dxa" w:w="4608"/>
             <w:shd w:val="clear" w:color="auto" w:fill="EFF6FF"/>
             <w:tcBorders>
               <w:top w:val="single" w:sz="8" w:space="0" w:color="3B82F6"/>
@@ -300,14 +302,14 @@
           </w:tcPr>
           <w:p>
             <w:pPr>
-              <w:spacing w:before="120" w:after="120"/>
+              <w:spacing w:before="100" w:after="100"/>
               <w:jc w:val="center"/>
             </w:pPr>
             <w:r>
               <w:rPr>
                 <w:b/>
                 <w:color w:val="1E40AF"/>
-                <w:sz w:val="20"/>
+                <w:sz w:val="19"/>
               </w:rPr>
               <w:t>Tautan Pengisian Mandiri:</w:t>
               <w:br/>
@@ -316,9 +318,44 @@
               <w:rPr>
                 <w:b/>
                 <w:color w:val="2563EB"/>
-                <w:sz w:val="22"/>
+                <w:sz w:val="20"/>
               </w:rPr>
               <w:t>https://s.bps.go.id/61_ECKalbar</w:t>
+            </w:r>
+          </w:p>
+        </w:tc>
+        <w:tc>
+          <w:tcPr>
+            <w:tcW w:type="dxa" w:w="4608"/>
+            <w:shd w:val="clear" w:color="auto" w:fill="F0FDF4"/>
+            <w:tcBorders>
+              <w:top w:val="single" w:sz="8" w:space="0" w:color="16A34A"/>
+              <w:left w:val="single" w:sz="8" w:space="0" w:color="16A34A"/>
+              <w:bottom w:val="single" w:sz="8" w:space="0" w:color="16A34A"/>
+              <w:right w:val="single" w:sz="8" w:space="0" w:color="16A34A"/>
+            </w:tcBorders>
+          </w:tcPr>
+          <w:p>
+            <w:pPr>
+              <w:spacing w:before="100" w:after="100"/>
+              <w:jc w:val="center"/>
+            </w:pPr>
+            <w:r>
+              <w:rPr>
+                <w:b/>
+                <w:color w:val="166534"/>
+                <w:sz w:val="19"/>
+              </w:rPr>
+              <w:t>Tutorial &amp; Panduan Tahapan:</w:t>
+              <w:br/>
+            </w:r>
+            <w:r>
+              <w:rPr>
+                <w:b/>
+                <w:color w:val="15803D"/>
+                <w:sz w:val="20"/>
+              </w:rPr>
+              <w:t>http://s.bps.go.id/Tutorial_cawi_keluarga</w:t>
             </w:r>
           </w:p>
         </w:tc>
@@ -326,11 +363,36 @@
     </w:tbl>
     <w:p>
       <w:pPr>
-        <w:spacing w:before="160" w:line="276" w:lineRule="auto"/>
+        <w:spacing w:before="120" w:after="80" w:line="276" w:lineRule="auto"/>
         <w:jc w:val="both"/>
       </w:pPr>
       <w:r>
-        <w:t>Perlu kami sampaikan bahwa apabila pegawai yang bersangkutan telah didatangi dan dilakukan pendataan secara langsung oleh petugas BPS, maka yang bersangkutan tidak perlu melakukan pengisian mandiri kembali.</w:t>
+        <w:t>Secara garis besar, tahapan pengisian mandiri (CAWI) meliputi:</w:t>
+        <w:br/>
+      </w:r>
+      <w:r>
+        <w:t>1. Akses tautan di atas dan masukkan Nomor KK serta NIK kepala keluarga / anggota keluarga;</w:t>
+        <w:br/>
+      </w:r>
+      <w:r>
+        <w:t>2. Lakukan verifikasi identitas, registrasi data pelengkap, verifikasi kode OTP, dan pembuatan PIN;</w:t>
+        <w:br/>
+      </w:r>
+      <w:r>
+        <w:t>3. Isi seluruh kuesioner pertanyaan SE2026 secara lengkap hingga konfirmasi pengiriman (submit);</w:t>
+        <w:br/>
+      </w:r>
+      <w:r>
+        <w:t>4. Menerima Bukti Penerimaan Elektronik (BPE) melalui email sebagai konfirmasi pengisian selesai.</w:t>
+      </w:r>
+    </w:p>
+    <w:p>
+      <w:pPr>
+        <w:spacing w:before="120" w:line="276" w:lineRule="auto"/>
+        <w:jc w:val="both"/>
+      </w:pPr>
+      <w:r>
+        <w:t>Perlu kami sampaikan pula bahwa apabila pegawai yang bersangkutan telah didatangi dan dilakukan pendataan secara langsung oleh petugas BPS, maka yang bersangkutan tidak perlu melakukan pengisian mandiri kembali.</w:t>
       </w:r>
     </w:p>
     <w:p>

</xml_diff>